<commit_message>
Roteiros sem os nomes dos integrantes
Co-Authored-By: Claude Opus 5.5 (1M context) <noreply@anthropic.com>
</commit_message>
<xml_diff>
--- a/apresentacao/roteiros/Parte 1 - Problema e fontes.docx
+++ b/apresentacao/roteiros/Parte 1 - Problema e fontes.docx
@@ -24,7 +24,7 @@
       </w:pPr>
       <w:r>
         <w:rPr/>
-        <w:t>Apresentador: Ivan Medina · slides 1 a 6 · cerca de 5 minutos</w:t>
+        <w:t>Slides 1 a 6 · cerca de 5 minutos</w:t>
       </w:r>
     </w:p>
     <w:p>
@@ -174,7 +174,7 @@
       </w:r>
       <w:r>
         <w:rPr/>
-        <w:t>Boa tarde, gente! A gente é o grupo do Ivan, Vinícius, Germano e Matheus, e o nosso trabalho é sobre a atenção primária à saúde aqui em São Carlos. A ideia foi montar um data warehouse que junta três coisas que normalmente ficam separadas: as equipes de saúde, os atendimentos e as internações que poderiam ter sido evitadas. No fim isso virou 3 tabelas de fatos, 9 dimensões e 5 consultas OLAP, que a gente vai mostrar. E esse mapa aí já é dado real: o contorno é do IBGE e os pontinhos são as unidades básicas cadastradas no CNES.”</w:t>
+        <w:t>Boa tarde, gente! O nosso trabalho é sobre a atenção primária à saúde aqui em São Carlos. A ideia foi montar um data warehouse que junta três coisas que normalmente ficam separadas: as equipes de saúde, os atendimentos e as internações que poderiam ter sido evitadas. No fim isso virou 3 tabelas de fatos, 9 dimensões e 5 consultas OLAP, que a gente vai mostrar. E esse mapa aí já é dado real: o contorno é do IBGE e os pontinhos são as unidades básicas cadastradas no CNES.”</w:t>
       </w:r>
     </w:p>
     <w:p>
@@ -270,7 +270,7 @@
       </w:r>
       <w:r>
         <w:rPr/>
-        <w:t>A apresentação tem quatro partes, uma pra cada um. Eu começo com o problema e as fontes de dados. O Vinícius mostra os processos de negócio e as estrelas. O Germano junta tudo na constelação e explica como a gente integrou os dados. E o Matheus fecha com as cinco consultas, já com os resultados reais.”</w:t>
+        <w:t>A apresentação tem quatro partes, uma pra cada um. A primeira é o problema e as fontes de dados. A segunda mostra os processos de negócio e as estrelas. A terceira junta tudo na constelação e explica como a gente integrou os dados. E a quarta fecha com as cinco consultas, já com os resultados reais.”</w:t>
       </w:r>
     </w:p>
     <w:p>
@@ -666,7 +666,7 @@
       </w:r>
       <w:r>
         <w:rPr/>
-        <w:t>E a pergunta que guia todo o trabalho é essa: mais atenção básica significa menos internações evitáveis? Pra responder, a gente precisa olhar três coisas juntas: a oferta, que é quantas equipes existem; o uso, que é quanto elas atendem; e o resultado, que são as ICSAP. O problema é que cada uma vem de um sistema diferente do SUS. Então o desafio do modelo é colocar as três na mesma linha do tempo, e isso o Germano e o Matheus vão mostrar mais pra frente.”</w:t>
+        <w:t>E a pergunta que guia todo o trabalho é essa: mais atenção básica significa menos internações evitáveis? Pra responder, a gente precisa olhar três coisas juntas: a oferta, que é quantas equipes existem; o uso, que é quanto elas atendem; e o resultado, que são as ICSAP. O problema é que cada uma vem de um sistema diferente do SUS. Então o desafio do modelo é colocar as três na mesma linha do tempo, e isso a gente mostra mais pra frente.”</w:t>
       </w:r>
     </w:p>
     <w:p>
@@ -869,7 +869,7 @@
       </w:r>
       <w:r>
         <w:rPr/>
-        <w:t>De onde vem tudo isso? Cinco fontes públicas. As três principais são do DATASUS: o CNES, que tem as equipes e os estabelecimentos; o SIH, com uma linha por internação; e o SIA, com a produção ambulatorial. E duas de apoio: o IBGE pros nomes dos municípios e a API do Ministério pra nome e bairro das unidades. A gente baixou com o PySUS. Os arquivos são do estado inteiro, mês a mês, então a gente filtrou São Carlos e juntou 2023 e 2024 num banco DuckDB. E a gente conferiu com o TabNet do Ministério: os números batem. Agora o Vinícius mostra como isso virou modelo.”</w:t>
+        <w:t>De onde vem tudo isso? Cinco fontes públicas. As três principais são do DATASUS: o CNES, que tem as equipes e os estabelecimentos; o SIH, com uma linha por internação; e o SIA, com a produção ambulatorial. E duas de apoio: o IBGE pros nomes dos municípios e a API do Ministério pra nome e bairro das unidades. A gente baixou com o PySUS. Os arquivos são do estado inteiro, mês a mês, então a gente filtrou São Carlos e juntou 2023 e 2024 num banco DuckDB. E a gente conferiu com o TabNet do Ministério: os números batem. Agora vamos ver como isso virou modelo.”</w:t>
       </w:r>
     </w:p>
     <w:p>

</xml_diff>